<commit_message>
Finalize Sahayak submission package
</commit_message>
<xml_diff>
--- a/01-Application/Sahayak-IdeasForIndia-Application-FILLED.docx
+++ b/01-Application/Sahayak-IdeasForIndia-Application-FILLED.docx
@@ -2063,11 +2063,29 @@
             </w:pPr>
             <w:r>
               <w:rPr>
+                <w:rFonts w:ascii="Calibri" w:hAnsi="Calibri" w:cs="Calibri" w:eastAsia="Calibri"/>
+                <w:sz w:val="24"/>
+                <w:szCs w:val="24"/>
+              </w:rPr>
+              <w:t xml:space="preserve">An estimated 80–90% of India’s workforce — over 400 million people — is “deskless”: nurses and ward staff, factory operators, warehouse pickers, delivery riders, field technicians, security and retail staff. Yet nearly every enterprise tool ever built — HR portals, intranets, knowledge bases, ticketing systems — assumes an English-speaking employee sitting at a computer.</w:t>
+            </w:r>
+          </w:p>
+          <w:p>
+            <w:pPr>
+              <w:spacing w:after="120"/>
+              <w:rPr>
                 <w:rFonts w:ascii="Calibri" w:hAnsi="Calibri" w:cs="Calibri"/>
                 <w:sz w:val="24"/>
                 <w:szCs w:val="24"/>
               </w:rPr>
-              <w:t xml:space="preserve">An estimated 80–90% of India’s workforce — over 400 million people — is “deskless”: nurses and ward staff, factory operators, warehouse pickers, delivery riders, field technicians, security and retail staff. Yet nearly every enterprise tool ever built — HR portals, intranets, knowledge bases, ticketing systems — assumes an English-speaking employee sitting at a computer.</w:t>
+            </w:pPr>
+            <w:r>
+              <w:rPr>
+                <w:rFonts w:ascii="Calibri" w:hAnsi="Calibri" w:cs="Calibri" w:eastAsia="Calibri"/>
+                <w:sz w:val="24"/>
+                <w:szCs w:val="24"/>
+              </w:rPr>
+              <w:t xml:space="preserve">The result is a daily exclusion that is invisible to office workers. A ward nurse in Lucknow cannot quickly check her leave balance or shift roster. A machine operator in Pune facing “Error 42” cannot search the English-only PDF manual, so the line stays down until a supervisor is free. Workers do not understand payslip deductions, miss PF/ESI entitlements, and skip filing grievances because the process needs a portal, a password and English. Safety SOPs exist but go unread, contributing to accidents and compliance failures.</w:t>
             </w:r>
           </w:p>
           <w:p>
@@ -2081,43 +2099,25 @@
             </w:pPr>
             <w:r>
               <w:rPr>
+                <w:rFonts w:ascii="Calibri" w:hAnsi="Calibri" w:cs="Calibri" w:eastAsia="Calibri"/>
+                <w:sz w:val="24"/>
+                <w:szCs w:val="24"/>
+              </w:rPr>
+              <w:t xml:space="preserve">The burden falls on three groups. Workers lose time, money and dignity — they depend on intermediaries for basic information about their own employment. HR and operations teams drown in repetitive queries — industry studies suggest 40–60% of HR tickets are routine questions. Employers pay through attrition, machine downtime, safety incidents and lost productivity.</w:t>
+            </w:r>
+          </w:p>
+          <w:p>
+            <w:pPr>
+              <w:spacing w:after="120"/>
+              <w:rPr>
                 <w:rFonts w:ascii="Calibri" w:hAnsi="Calibri" w:cs="Calibri"/>
                 <w:sz w:val="24"/>
                 <w:szCs w:val="24"/>
               </w:rPr>
-              <w:t xml:space="preserve">The result is a daily exclusion that is invisible to office workers. A ward nurse in Lucknow cannot quickly check her leave balance or shift roster. A machine operator in Pune facing “Error 42” cannot search the English-only PDF manual, so the line stays down until a supervisor is free. Workers do not understand payslip deductions, miss PF/ESI entitlements, and skip filing grievances because the process needs a portal, a password and English. Safety SOPs exist but go unread, contributing to accidents and compliance failures.</w:t>
-            </w:r>
-          </w:p>
-          <w:p>
-            <w:pPr>
-              <w:spacing w:after="120"/>
-              <w:rPr>
-                <w:rFonts w:ascii="Calibri" w:hAnsi="Calibri" w:cs="Calibri"/>
-                <w:sz w:val="24"/>
-                <w:szCs w:val="24"/>
-              </w:rPr>
-            </w:pPr>
-            <w:r>
-              <w:rPr>
-                <w:rFonts w:ascii="Calibri" w:hAnsi="Calibri" w:cs="Calibri"/>
-                <w:sz w:val="24"/>
-                <w:szCs w:val="24"/>
-              </w:rPr>
-              <w:t xml:space="preserve">The burden falls on three groups. Workers lose time, money and dignity — they depend on intermediaries for basic information about their own employment. HR and operations teams drown in repetitive queries — industry studies suggest 40–60% of HR tickets are routine questions. Employers pay through attrition, machine downtime, safety incidents and lost productivity.</w:t>
-            </w:r>
-          </w:p>
-          <w:p>
-            <w:pPr>
-              <w:spacing w:after="120"/>
-              <w:rPr>
-                <w:rFonts w:ascii="Calibri" w:hAnsi="Calibri" w:cs="Calibri"/>
-                <w:sz w:val="24"/>
-                <w:szCs w:val="24"/>
-              </w:rPr>
-            </w:pPr>
-            <w:r>
-              <w:rPr>
-                <w:rFonts w:ascii="Calibri" w:hAnsi="Calibri" w:cs="Calibri"/>
+            </w:pPr>
+            <w:r>
+              <w:rPr>
+                <w:rFonts w:ascii="Calibri" w:hAnsi="Calibri" w:cs="Calibri" w:eastAsia="Calibri"/>
                 <w:sz w:val="24"/>
                 <w:szCs w:val="24"/>
               </w:rPr>
@@ -2233,13 +2233,41 @@
             </w:pPr>
             <w:r>
               <w:rPr>
+                <w:rFonts w:ascii="Calibri" w:hAnsi="Calibri" w:cs="Calibri" w:eastAsia="Calibri"/>
+                <w:sz w:val="24"/>
+                <w:szCs w:val="24"/>
+              </w:rPr>
+            </w:r>
+            <w:r>
+              <w:rPr>
+                <w:rFonts w:ascii="Calibri" w:hAnsi="Calibri" w:eastAsia="Calibri"/>
+                <w:sz w:val="24"/>
+              </w:rPr>
+              <w:t>Sahayak is a voice-first AI work assistant that lives where India's workers already are: WhatsApp. A worker sends a voice note or text in Hindi, Gujarati, Hinglish or English and gets a spoken/text answer, a cited SOP step, or a completed HR action such as leave application, escalation or shift lookup.</w:t>
+            </w:r>
+          </w:p>
+          <w:p>
+            <w:pPr>
+              <w:spacing w:after="120"/>
+              <w:rPr>
                 <w:rFonts w:ascii="Calibri" w:hAnsi="Calibri" w:cs="Calibri"/>
                 <w:sz w:val="24"/>
                 <w:szCs w:val="24"/>
               </w:rPr>
-            </w:r>
-            <w:r>
-              <w:t>Sahayak is a voice-first AI work assistant that lives where India's workers already are: WhatsApp. A worker sends a voice note or text in Hindi, Gujarati, Hinglish or English and gets a spoken/text answer, a cited SOP step, or a completed HR action such as leave application, escalation or shift lookup.</w:t>
+            </w:pPr>
+            <w:r>
+              <w:rPr>
+                <w:rFonts w:ascii="Calibri" w:hAnsi="Calibri" w:cs="Calibri" w:eastAsia="Calibri"/>
+                <w:sz w:val="24"/>
+                <w:szCs w:val="24"/>
+              </w:rPr>
+            </w:r>
+            <w:r>
+              <w:rPr>
+                <w:rFonts w:ascii="Calibri" w:hAnsi="Calibri" w:eastAsia="Calibri"/>
+                <w:sz w:val="24"/>
+              </w:rPr>
+              <w:t>The product has three layers. First, a multilingual voice interface removes English and literacy barriers. Second, a retrieval layer answers only from employer-approved SOPs, HR policies and worker records, with citations and an "I don't know" human handoff when confidence is low. Third, an action layer connects to HRMS/operations systems so the assistant can file requests, update supervisors and log outcomes.</w:t>
             </w:r>
           </w:p>
           <w:p>
@@ -2253,52 +2281,40 @@
             </w:pPr>
             <w:r>
               <w:rPr>
+                <w:rFonts w:ascii="Calibri" w:hAnsi="Calibri" w:cs="Calibri" w:eastAsia="Calibri"/>
+                <w:sz w:val="24"/>
+                <w:szCs w:val="24"/>
+              </w:rPr>
+            </w:r>
+            <w:r>
+              <w:rPr>
+                <w:rFonts w:ascii="Calibri" w:hAnsi="Calibri" w:eastAsia="Calibri"/>
+                <w:sz w:val="24"/>
+              </w:rPr>
+              <w:t>The idea is design-thinking-led: we designed for the least-served worker first - low literacy, entry-level phone, patchy bandwidth and no portal training - and made that the default experience for everyone. Existing enterprise chatbots are usually English-first, web-based FAQ tools for office staff. Sahayak is worker-side, voice-first, code-switch-native and action-oriented.</w:t>
+            </w:r>
+          </w:p>
+          <w:p>
+            <w:pPr>
+              <w:spacing w:after="120"/>
+              <w:rPr>
                 <w:rFonts w:ascii="Calibri" w:hAnsi="Calibri" w:cs="Calibri"/>
                 <w:sz w:val="24"/>
                 <w:szCs w:val="24"/>
               </w:rPr>
-            </w:r>
-            <w:r>
-              <w:t>The product has three layers. First, a multilingual voice interface removes English and literacy barriers. Second, a retrieval layer answers only from employer-approved SOPs, HR policies and worker records, with citations and an "I don't know" human handoff when confidence is low. Third, an action layer connects to HRMS/operations systems so the assistant can file requests, update supervisors and log outcomes.</w:t>
-            </w:r>
-          </w:p>
-          <w:p>
-            <w:pPr>
-              <w:spacing w:after="120"/>
-              <w:rPr>
-                <w:rFonts w:ascii="Calibri" w:hAnsi="Calibri" w:cs="Calibri"/>
+            </w:pPr>
+            <w:r>
+              <w:rPr>
+                <w:rFonts w:ascii="Calibri" w:hAnsi="Calibri" w:cs="Calibri" w:eastAsia="Calibri"/>
                 <w:sz w:val="24"/>
                 <w:szCs w:val="24"/>
               </w:rPr>
-            </w:pPr>
-            <w:r>
-              <w:rPr>
-                <w:rFonts w:ascii="Calibri" w:hAnsi="Calibri" w:cs="Calibri"/>
-                <w:sz w:val="24"/>
-                <w:szCs w:val="24"/>
-              </w:rPr>
-            </w:r>
-            <w:r>
-              <w:t>The idea is design-thinking-led: we designed for the least-served worker first - low literacy, entry-level phone, patchy bandwidth and no portal training - and made that the default experience for everyone. Existing enterprise chatbots are usually English-first, web-based FAQ tools for office staff. Sahayak is worker-side, voice-first, code-switch-native and action-oriented.</w:t>
-            </w:r>
-          </w:p>
-          <w:p>
-            <w:pPr>
-              <w:spacing w:after="120"/>
-              <w:rPr>
-                <w:rFonts w:ascii="Calibri" w:hAnsi="Calibri" w:cs="Calibri"/>
-                <w:sz w:val="24"/>
-                <w:szCs w:val="24"/>
-              </w:rPr>
-            </w:pPr>
-            <w:r>
-              <w:rPr>
-                <w:rFonts w:ascii="Calibri" w:hAnsi="Calibri" w:cs="Calibri"/>
-                <w:sz w:val="24"/>
-                <w:szCs w:val="24"/>
-              </w:rPr>
-            </w:r>
-            <w:r>
+            </w:r>
+            <w:r>
+              <w:rPr>
+                <w:rFonts w:ascii="Calibri" w:hAnsi="Calibri" w:eastAsia="Calibri"/>
+                <w:sz w:val="24"/>
+              </w:rPr>
               <w:t>For India's manufacturing and innovation ambitions, this matters because frontline productivity is the multiplier. When an operator gets a safe SOP answer at the machine, or a hospital worker resolves an HR query without leaving the ward, time, trust and compliance improve together.</w:t>
             </w:r>
           </w:p>
@@ -2442,13 +2458,41 @@
             </w:pPr>
             <w:r>
               <w:rPr>
+                <w:rFonts w:ascii="Calibri" w:hAnsi="Calibri" w:cs="Calibri" w:eastAsia="Calibri"/>
+                <w:sz w:val="24"/>
+                <w:szCs w:val="24"/>
+              </w:rPr>
+            </w:r>
+            <w:r>
+              <w:rPr>
+                <w:rFonts w:ascii="Calibri" w:hAnsi="Calibri" w:eastAsia="Calibri"/>
+                <w:sz w:val="24"/>
+              </w:rPr>
+              <w:t>Sahayak contributes directly to Inclusive Innovation for Bharat across healthcare, skilling and financial inclusion.</w:t>
+            </w:r>
+          </w:p>
+          <w:p>
+            <w:pPr>
+              <w:spacing w:after="120"/>
+              <w:rPr>
                 <w:rFonts w:ascii="Calibri" w:hAnsi="Calibri" w:cs="Calibri"/>
                 <w:sz w:val="24"/>
                 <w:szCs w:val="24"/>
               </w:rPr>
-            </w:r>
-            <w:r>
-              <w:t>Sahayak contributes directly to Inclusive Innovation for Bharat across healthcare, skilling and financial inclusion.</w:t>
+            </w:pPr>
+            <w:r>
+              <w:rPr>
+                <w:rFonts w:ascii="Calibri" w:hAnsi="Calibri" w:cs="Calibri" w:eastAsia="Calibri"/>
+                <w:sz w:val="24"/>
+                <w:szCs w:val="24"/>
+              </w:rPr>
+            </w:r>
+            <w:r>
+              <w:rPr>
+                <w:rFonts w:ascii="Calibri" w:hAnsi="Calibri" w:eastAsia="Calibri"/>
+                <w:sz w:val="24"/>
+              </w:rPr>
+              <w:t>Healthcare: the first deployment scenario is a hospital. Nurses and support staff get instant voice-based access to infection-control protocols, drug-handling SOPs, rosters and HR services in their own language. Faster protocol access and better-informed staff can reduce avoidable delays and safety mistakes.</w:t>
             </w:r>
           </w:p>
           <w:p>
@@ -2462,13 +2506,41 @@
             </w:pPr>
             <w:r>
               <w:rPr>
+                <w:rFonts w:ascii="Calibri" w:hAnsi="Calibri" w:cs="Calibri" w:eastAsia="Calibri"/>
+                <w:sz w:val="24"/>
+                <w:szCs w:val="24"/>
+              </w:rPr>
+            </w:r>
+            <w:r>
+              <w:rPr>
+                <w:rFonts w:ascii="Calibri" w:hAnsi="Calibri" w:eastAsia="Calibri"/>
+                <w:sz w:val="24"/>
+              </w:rPr>
+              <w:t>Skilling: every answered SOP question is a micro-learning moment delivered on the job, at the moment of need. The supervisor dashboard converts repeated query patterns into a training-gap heatmap, helping employers decide which safety, machine or process topics need refresher sessions.</w:t>
+            </w:r>
+          </w:p>
+          <w:p>
+            <w:pPr>
+              <w:spacing w:after="120"/>
+              <w:rPr>
                 <w:rFonts w:ascii="Calibri" w:hAnsi="Calibri" w:cs="Calibri"/>
                 <w:sz w:val="24"/>
                 <w:szCs w:val="24"/>
               </w:rPr>
-            </w:r>
-            <w:r>
-              <w:t>Healthcare: the first deployment scenario is a hospital. Nurses and support staff get instant voice-based access to infection-control protocols, drug-handling SOPs, rosters and HR services in their own language. Faster protocol access and better-informed staff can reduce avoidable delays and safety mistakes.</w:t>
+            </w:pPr>
+            <w:r>
+              <w:rPr>
+                <w:rFonts w:ascii="Calibri" w:hAnsi="Calibri" w:cs="Calibri" w:eastAsia="Calibri"/>
+                <w:sz w:val="24"/>
+                <w:szCs w:val="24"/>
+              </w:rPr>
+            </w:r>
+            <w:r>
+              <w:rPr>
+                <w:rFonts w:ascii="Calibri" w:hAnsi="Calibri" w:eastAsia="Calibri"/>
+                <w:sz w:val="24"/>
+              </w:rPr>
+              <w:t>Financial inclusion: workers can understand payslips, deductions, PF/ESI contributions, leave balances and eligible benefits conversationally. This improves access to entitlements without requiring English, a desktop portal or HR dependency.</w:t>
             </w:r>
           </w:p>
           <w:p>
@@ -2482,72 +2554,40 @@
             </w:pPr>
             <w:r>
               <w:rPr>
+                <w:rFonts w:ascii="Calibri" w:hAnsi="Calibri" w:cs="Calibri" w:eastAsia="Calibri"/>
+                <w:sz w:val="24"/>
+                <w:szCs w:val="24"/>
+              </w:rPr>
+            </w:r>
+            <w:r>
+              <w:rPr>
+                <w:rFonts w:ascii="Calibri" w:hAnsi="Calibri" w:eastAsia="Calibri"/>
+                <w:sz w:val="24"/>
+              </w:rPr>
+              <w:t>The underserved group is India's non-English-speaking, low-literacy, mobile-only workforce. Sahayak removes three exclusion barriers: language through Indic voice support, access through WhatsApp/entry-level phones, and trust through citations, explicit worker consent and human handoff for uncertain or sensitive cases.</w:t>
+            </w:r>
+          </w:p>
+          <w:p>
+            <w:pPr>
+              <w:spacing w:after="120"/>
+              <w:rPr>
                 <w:rFonts w:ascii="Calibri" w:hAnsi="Calibri" w:cs="Calibri"/>
                 <w:sz w:val="24"/>
                 <w:szCs w:val="24"/>
               </w:rPr>
-            </w:r>
-            <w:r>
-              <w:t>Skilling: every answered SOP question is a micro-learning moment delivered on the job, at the moment of need. The supervisor dashboard converts repeated query patterns into a training-gap heatmap, helping employers decide which safety, machine or process topics need refresher sessions.</w:t>
-            </w:r>
-          </w:p>
-          <w:p>
-            <w:pPr>
-              <w:spacing w:after="120"/>
-              <w:rPr>
-                <w:rFonts w:ascii="Calibri" w:hAnsi="Calibri" w:cs="Calibri"/>
+            </w:pPr>
+            <w:r>
+              <w:rPr>
+                <w:rFonts w:ascii="Calibri" w:hAnsi="Calibri" w:cs="Calibri" w:eastAsia="Calibri"/>
                 <w:sz w:val="24"/>
                 <w:szCs w:val="24"/>
               </w:rPr>
-            </w:pPr>
-            <w:r>
-              <w:rPr>
-                <w:rFonts w:ascii="Calibri" w:hAnsi="Calibri" w:cs="Calibri"/>
-                <w:sz w:val="24"/>
-                <w:szCs w:val="24"/>
-              </w:rPr>
-            </w:r>
-            <w:r>
-              <w:t>Financial inclusion: workers can understand payslips, deductions, PF/ESI contributions, leave balances and eligible benefits conversationally. This improves access to entitlements without requiring English, a desktop portal or HR dependency.</w:t>
-            </w:r>
-          </w:p>
-          <w:p>
-            <w:pPr>
-              <w:spacing w:after="120"/>
-              <w:rPr>
-                <w:rFonts w:ascii="Calibri" w:hAnsi="Calibri" w:cs="Calibri"/>
-                <w:sz w:val="24"/>
-                <w:szCs w:val="24"/>
-              </w:rPr>
-            </w:pPr>
-            <w:r>
-              <w:rPr>
-                <w:rFonts w:ascii="Calibri" w:hAnsi="Calibri" w:cs="Calibri"/>
-                <w:sz w:val="24"/>
-                <w:szCs w:val="24"/>
-              </w:rPr>
-            </w:r>
-            <w:r>
-              <w:t>The underserved group is India's non-English-speaking, low-literacy, mobile-only workforce. Sahayak removes three exclusion barriers: language through Indic voice support, access through WhatsApp/entry-level phones, and trust through citations, explicit worker consent and human handoff for uncertain or sensitive cases.</w:t>
-            </w:r>
-          </w:p>
-          <w:p>
-            <w:pPr>
-              <w:spacing w:after="120"/>
-              <w:rPr>
-                <w:rFonts w:ascii="Calibri" w:hAnsi="Calibri" w:cs="Calibri"/>
-                <w:sz w:val="24"/>
-                <w:szCs w:val="24"/>
-              </w:rPr>
-            </w:pPr>
-            <w:r>
-              <w:rPr>
-                <w:rFonts w:ascii="Calibri" w:hAnsi="Calibri" w:cs="Calibri"/>
-                <w:sz w:val="24"/>
-                <w:szCs w:val="24"/>
-              </w:rPr>
-            </w:r>
-            <w:r>
+            </w:r>
+            <w:r>
+              <w:rPr>
+                <w:rFonts w:ascii="Calibri" w:hAnsi="Calibri" w:eastAsia="Calibri"/>
+                <w:sz w:val="24"/>
+              </w:rPr>
               <w:t>Impact will be measured through first-contact resolution, reduction in repetitive HR queries, adoption among pilot workers, entitlement uptake, safety/escalation resolution time and worker satisfaction. The goal is practical inclusion: not a new portal for the already-connected, but workplace self-service for people currently left out of enterprise software.</w:t>
             </w:r>
           </w:p>
@@ -2771,13 +2811,41 @@
             </w:pPr>
             <w:r>
               <w:rPr>
+                <w:rFonts w:ascii="Calibri" w:hAnsi="Calibri" w:cs="Calibri" w:eastAsia="Calibri"/>
+                <w:sz w:val="24"/>
+                <w:szCs w:val="24"/>
+              </w:rPr>
+            </w:r>
+            <w:r>
+              <w:rPr>
+                <w:rFonts w:ascii="Calibri" w:hAnsi="Calibri" w:eastAsia="Calibri"/>
+                <w:sz w:val="24"/>
+              </w:rPr>
+              <w:t>Current stage: functional prototype completed for hackathon demonstration.</w:t>
+            </w:r>
+          </w:p>
+          <w:p>
+            <w:pPr>
+              <w:spacing w:after="120"/>
+              <w:rPr>
                 <w:rFonts w:ascii="Calibri" w:hAnsi="Calibri" w:cs="Calibri"/>
                 <w:sz w:val="24"/>
                 <w:szCs w:val="24"/>
               </w:rPr>
-            </w:r>
-            <w:r>
-              <w:t>Current stage: functional prototype completed for hackathon demonstration.</w:t>
+            </w:pPr>
+            <w:r>
+              <w:rPr>
+                <w:rFonts w:ascii="Calibri" w:hAnsi="Calibri" w:cs="Calibri" w:eastAsia="Calibri"/>
+                <w:sz w:val="24"/>
+                <w:szCs w:val="24"/>
+              </w:rPr>
+            </w:r>
+            <w:r>
+              <w:rPr>
+                <w:rFonts w:ascii="Calibri" w:hAnsi="Calibri" w:eastAsia="Calibri"/>
+                <w:sz w:val="24"/>
+              </w:rPr>
+              <w:t>What exists today: a working FastAPI + SQLite backend, WhatsApp-style worker chat UI, supervisor dashboard, deterministic multilingual intent engine, mock HRMS records, leave approval workflow, escalation queue, SOP retrieval with citation cards, language/intent analytics and a resettable demo database. The prototype runs locally without API keys and demonstrates Hindi, Gujarati and English flows.</w:t>
             </w:r>
           </w:p>
           <w:p>
@@ -2791,32 +2859,16 @@
             </w:pPr>
             <w:r>
               <w:rPr>
-                <w:rFonts w:ascii="Calibri" w:hAnsi="Calibri" w:cs="Calibri"/>
+                <w:rFonts w:ascii="Calibri" w:hAnsi="Calibri" w:cs="Calibri" w:eastAsia="Calibri"/>
                 <w:sz w:val="24"/>
                 <w:szCs w:val="24"/>
               </w:rPr>
             </w:r>
             <w:r>
-              <w:t>What exists today: a working FastAPI + SQLite backend, WhatsApp-style worker chat UI, supervisor dashboard, deterministic multilingual intent engine, mock HRMS records, leave approval workflow, escalation queue, SOP retrieval with citation cards, language/intent analytics and a resettable demo database. The prototype runs locally without API keys and demonstrates Hindi, Gujarati and English flows.</w:t>
-            </w:r>
-          </w:p>
-          <w:p>
-            <w:pPr>
-              <w:spacing w:after="120"/>
-              <w:rPr>
-                <w:rFonts w:ascii="Calibri" w:hAnsi="Calibri" w:cs="Calibri"/>
-                <w:sz w:val="24"/>
-                <w:szCs w:val="24"/>
-              </w:rPr>
-            </w:pPr>
-            <w:r>
-              <w:rPr>
-                <w:rFonts w:ascii="Calibri" w:hAnsi="Calibri" w:cs="Calibri"/>
-                <w:sz w:val="24"/>
-                <w:szCs w:val="24"/>
-              </w:rPr>
-            </w:r>
-            <w:r>
+              <w:rPr>
+                <w:rFonts w:ascii="Calibri" w:hAnsi="Calibri" w:eastAsia="Calibri"/>
+                <w:sz w:val="24"/>
+              </w:rPr>
               <w:t>Validation status: not yet field-tested with real workers or live enterprise systems. It has been internally tested through the prepared demo script: leave balance, leave filing, supervisor approval notification, SOP citation, Gujarati shift query, escalation and dashboard analytics. Post-challenge validation will be a 6-month two-site pilot, one hospital and one manufacturing SME, measuring resolution rate, HR ticket deflection, adoption, safety-query patterns and worker satisfaction.</w:t>
             </w:r>
           </w:p>
@@ -2965,13 +3017,41 @@
             </w:pPr>
             <w:r>
               <w:rPr>
+                <w:rFonts w:ascii="Calibri" w:hAnsi="Calibri" w:cs="Calibri" w:eastAsia="Calibri"/>
+                <w:sz w:val="24"/>
+                <w:szCs w:val="24"/>
+              </w:rPr>
+            </w:r>
+            <w:r>
+              <w:rPr>
+                <w:rFonts w:ascii="Calibri" w:hAnsi="Calibri" w:eastAsia="Calibri"/>
+                <w:sz w:val="24"/>
+              </w:rPr>
+              <w:t>Sahayak is innovative in five connected ways.</w:t>
+            </w:r>
+          </w:p>
+          <w:p>
+            <w:pPr>
+              <w:spacing w:after="120"/>
+              <w:rPr>
                 <w:rFonts w:ascii="Calibri" w:hAnsi="Calibri" w:cs="Calibri"/>
                 <w:sz w:val="24"/>
                 <w:szCs w:val="24"/>
               </w:rPr>
-            </w:r>
-            <w:r>
-              <w:t>Sahayak is innovative in five connected ways.</w:t>
+            </w:pPr>
+            <w:r>
+              <w:rPr>
+                <w:rFonts w:ascii="Calibri" w:hAnsi="Calibri" w:cs="Calibri" w:eastAsia="Calibri"/>
+                <w:sz w:val="24"/>
+                <w:szCs w:val="24"/>
+              </w:rPr>
+            </w:r>
+            <w:r>
+              <w:rPr>
+                <w:rFonts w:ascii="Calibri" w:hAnsi="Calibri" w:eastAsia="Calibri"/>
+                <w:sz w:val="24"/>
+              </w:rPr>
+              <w:t>1. Voice-first, code-switch-native UX. It treats Hindi, Gujarati, Hinglish and English as normal workplace speech, not as translated menu options. Voice in and voice out make low literacy a supported mode, not an exception.</w:t>
             </w:r>
           </w:p>
           <w:p>
@@ -2985,13 +3065,41 @@
             </w:pPr>
             <w:r>
               <w:rPr>
+                <w:rFonts w:ascii="Calibri" w:hAnsi="Calibri" w:cs="Calibri" w:eastAsia="Calibri"/>
+                <w:sz w:val="24"/>
+                <w:szCs w:val="24"/>
+              </w:rPr>
+            </w:r>
+            <w:r>
+              <w:rPr>
+                <w:rFonts w:ascii="Calibri" w:hAnsi="Calibri" w:eastAsia="Calibri"/>
+                <w:sz w:val="24"/>
+              </w:rPr>
+              <w:t>2. Agentic HR actions. It does not only answer questions; it files leave, raises escalations, routes approvals and notifies workers, with explicit confirmation and audit trails.</w:t>
+            </w:r>
+          </w:p>
+          <w:p>
+            <w:pPr>
+              <w:spacing w:after="120"/>
+              <w:rPr>
                 <w:rFonts w:ascii="Calibri" w:hAnsi="Calibri" w:cs="Calibri"/>
                 <w:sz w:val="24"/>
                 <w:szCs w:val="24"/>
               </w:rPr>
-            </w:r>
-            <w:r>
-              <w:t>1. Voice-first, code-switch-native UX. It treats Hindi, Gujarati, Hinglish and English as normal workplace speech, not as translated menu options. Voice in and voice out make low literacy a supported mode, not an exception.</w:t>
+            </w:pPr>
+            <w:r>
+              <w:rPr>
+                <w:rFonts w:ascii="Calibri" w:hAnsi="Calibri" w:cs="Calibri" w:eastAsia="Calibri"/>
+                <w:sz w:val="24"/>
+                <w:szCs w:val="24"/>
+              </w:rPr>
+            </w:r>
+            <w:r>
+              <w:rPr>
+                <w:rFonts w:ascii="Calibri" w:hAnsi="Calibri" w:eastAsia="Calibri"/>
+                <w:sz w:val="24"/>
+              </w:rPr>
+              <w:t>3. Evidence-grounded SOP help. SOP answers come with source citations. If the system is unsure or the query is sensitive, it refuses to guess and hands off to a human.</w:t>
             </w:r>
           </w:p>
           <w:p>
@@ -3005,13 +3113,41 @@
             </w:pPr>
             <w:r>
               <w:rPr>
+                <w:rFonts w:ascii="Calibri" w:hAnsi="Calibri" w:cs="Calibri" w:eastAsia="Calibri"/>
+                <w:sz w:val="24"/>
+                <w:szCs w:val="24"/>
+              </w:rPr>
+            </w:r>
+            <w:r>
+              <w:rPr>
+                <w:rFonts w:ascii="Calibri" w:hAnsi="Calibri" w:eastAsia="Calibri"/>
+                <w:sz w:val="24"/>
+              </w:rPr>
+              <w:t>4. Zero-install distribution. WhatsApp delivery avoids app rollout, passwords and training, which are common reasons frontline digitization fails.</w:t>
+            </w:r>
+          </w:p>
+          <w:p>
+            <w:pPr>
+              <w:spacing w:after="120"/>
+              <w:rPr>
                 <w:rFonts w:ascii="Calibri" w:hAnsi="Calibri" w:cs="Calibri"/>
                 <w:sz w:val="24"/>
                 <w:szCs w:val="24"/>
               </w:rPr>
-            </w:r>
-            <w:r>
-              <w:t>2. Agentic HR actions. It does not only answer questions; it files leave, raises escalations, routes approvals and notifies workers, with explicit confirmation and audit trails.</w:t>
+            </w:pPr>
+            <w:r>
+              <w:rPr>
+                <w:rFonts w:ascii="Calibri" w:hAnsi="Calibri" w:cs="Calibri" w:eastAsia="Calibri"/>
+                <w:sz w:val="24"/>
+                <w:szCs w:val="24"/>
+              </w:rPr>
+            </w:r>
+            <w:r>
+              <w:rPr>
+                <w:rFonts w:ascii="Calibri" w:hAnsi="Calibri" w:eastAsia="Calibri"/>
+                <w:sz w:val="24"/>
+              </w:rPr>
+              <w:t>5. Organizational learning loop. Repeated worker questions become a dashboard showing training gaps, SOP confusion, language mix and escalation hotspots.</w:t>
             </w:r>
           </w:p>
           <w:p>
@@ -3025,72 +3161,16 @@
             </w:pPr>
             <w:r>
               <w:rPr>
-                <w:rFonts w:ascii="Calibri" w:hAnsi="Calibri" w:cs="Calibri"/>
+                <w:rFonts w:ascii="Calibri" w:hAnsi="Calibri" w:cs="Calibri" w:eastAsia="Calibri"/>
                 <w:sz w:val="24"/>
                 <w:szCs w:val="24"/>
               </w:rPr>
             </w:r>
             <w:r>
-              <w:t>3. Evidence-grounded SOP help. SOP answers come with source citations. If the system is unsure or the query is sensitive, it refuses to guess and hands off to a human.</w:t>
-            </w:r>
-          </w:p>
-          <w:p>
-            <w:pPr>
-              <w:spacing w:after="120"/>
-              <w:rPr>
-                <w:rFonts w:ascii="Calibri" w:hAnsi="Calibri" w:cs="Calibri"/>
-                <w:sz w:val="24"/>
-                <w:szCs w:val="24"/>
-              </w:rPr>
-            </w:pPr>
-            <w:r>
-              <w:rPr>
-                <w:rFonts w:ascii="Calibri" w:hAnsi="Calibri" w:cs="Calibri"/>
-                <w:sz w:val="24"/>
-                <w:szCs w:val="24"/>
-              </w:rPr>
-            </w:r>
-            <w:r>
-              <w:t>4. Zero-install distribution. WhatsApp delivery avoids app rollout, passwords and training, which are common reasons frontline digitization fails.</w:t>
-            </w:r>
-          </w:p>
-          <w:p>
-            <w:pPr>
-              <w:spacing w:after="120"/>
-              <w:rPr>
-                <w:rFonts w:ascii="Calibri" w:hAnsi="Calibri" w:cs="Calibri"/>
-                <w:sz w:val="24"/>
-                <w:szCs w:val="24"/>
-              </w:rPr>
-            </w:pPr>
-            <w:r>
-              <w:rPr>
-                <w:rFonts w:ascii="Calibri" w:hAnsi="Calibri" w:cs="Calibri"/>
-                <w:sz w:val="24"/>
-                <w:szCs w:val="24"/>
-              </w:rPr>
-            </w:r>
-            <w:r>
-              <w:t>5. Organizational learning loop. Repeated worker questions become a dashboard showing training gaps, SOP confusion, language mix and escalation hotspots.</w:t>
-            </w:r>
-          </w:p>
-          <w:p>
-            <w:pPr>
-              <w:spacing w:after="120"/>
-              <w:rPr>
-                <w:rFonts w:ascii="Calibri" w:hAnsi="Calibri" w:cs="Calibri"/>
-                <w:sz w:val="24"/>
-                <w:szCs w:val="24"/>
-              </w:rPr>
-            </w:pPr>
-            <w:r>
-              <w:rPr>
-                <w:rFonts w:ascii="Calibri" w:hAnsi="Calibri" w:cs="Calibri"/>
-                <w:sz w:val="24"/>
-                <w:szCs w:val="24"/>
-              </w:rPr>
-            </w:r>
-            <w:r>
+              <w:rPr>
+                <w:rFonts w:ascii="Calibri" w:hAnsi="Calibri" w:eastAsia="Calibri"/>
+                <w:sz w:val="24"/>
+              </w:rPr>
               <w:t>The novelty is the combination: worker-side voice access, employer-specific knowledge, action completion and supervisor intelligence in one affordable system for Indian SMEs and institutions. Existing HR tools mostly serve office staff; Sahayak is built around the realities of a nurse, machine operator or warehouse worker using an entry-level phone during a shift.</w:t>
             </w:r>
           </w:p>
@@ -4347,7 +4427,7 @@
             </w:pPr>
             <w:r>
               <w:rPr>
-                <w:rFonts w:ascii="Calibri" w:hAnsi="Calibri" w:cs="Calibri"/>
+                <w:rFonts w:ascii="Calibri" w:hAnsi="Calibri" w:cs="Calibri" w:eastAsia="Calibri"/>
                 <w:sz w:val="24"/>
                 <w:szCs w:val="24"/>
               </w:rPr>
@@ -4471,7 +4551,7 @@
             </w:pPr>
             <w:r>
               <w:rPr>
-                <w:rFonts w:ascii="Calibri" w:hAnsi="Calibri" w:cs="Calibri"/>
+                <w:rFonts w:ascii="Calibri" w:hAnsi="Calibri" w:cs="Calibri" w:eastAsia="Calibri"/>
                 <w:sz w:val="24"/>
                 <w:szCs w:val="24"/>
               </w:rPr>
@@ -4603,11 +4683,29 @@
             </w:pPr>
             <w:r>
               <w:rPr>
+                <w:rFonts w:ascii="Calibri" w:hAnsi="Calibri" w:cs="Calibri" w:eastAsia="Calibri"/>
+                <w:sz w:val="24"/>
+                <w:szCs w:val="24"/>
+              </w:rPr>
+              <w:t xml:space="preserve">Financial sustainability: Sahayak is B2B SaaS priced per employee per month (target ₹30–50 PEPM) — affordable for an SME with 500 workers (~₹15–25k/month) and scaling linearly with value delivered. Pilots convert to paid contracts; unit economics improve as speech and language model costs fall. We deliberately avoid ad- or data-monetization models: worker trust is the product’s foundation.</w:t>
+            </w:r>
+          </w:p>
+          <w:p>
+            <w:pPr>
+              <w:spacing w:after="120"/>
+              <w:rPr>
                 <w:rFonts w:ascii="Calibri" w:hAnsi="Calibri" w:cs="Calibri"/>
                 <w:sz w:val="24"/>
                 <w:szCs w:val="24"/>
               </w:rPr>
-              <w:t xml:space="preserve">Financial sustainability: Sahayak is B2B SaaS priced per employee per month (target ₹30–50 PEPM) — affordable for an SME with 500 workers (~₹15–25k/month) and scaling linearly with value delivered. Pilots convert to paid contracts; unit economics improve as speech and language model costs fall. We deliberately avoid ad- or data-monetization models: worker trust is the product’s foundation.</w:t>
+            </w:pPr>
+            <w:r>
+              <w:rPr>
+                <w:rFonts w:ascii="Calibri" w:hAnsi="Calibri" w:cs="Calibri" w:eastAsia="Calibri"/>
+                <w:sz w:val="24"/>
+                <w:szCs w:val="24"/>
+              </w:rPr>
+              <w:t xml:space="preserve">Technical scalability: cloud-native and multi-tenant from day one. Three design choices make scale cheap: (1) a connector architecture, so each new HRMS/ERP integration is a module, not a rebuild; (2) language packs — adding a language is configuration on top of Bhashini/Sarvam models, taking us from 3 to 11+ languages without re-engineering; (3) WhatsApp distribution, so onboarding a 1,000-worker factory is a data-ingestion exercise, not a device rollout.</w:t>
             </w:r>
           </w:p>
           <w:p>
@@ -4621,11 +4719,29 @@
             </w:pPr>
             <w:r>
               <w:rPr>
+                <w:rFonts w:ascii="Calibri" w:hAnsi="Calibri" w:cs="Calibri" w:eastAsia="Calibri"/>
+                <w:sz w:val="24"/>
+                <w:szCs w:val="24"/>
+              </w:rPr>
+              <w:t xml:space="preserve">Market scalability: the same product serves hospitals, factories, warehouses, retail chains and facility-management firms with only content changes. India first; the model generalizes to any multilingual emerging-market workforce.</w:t>
+            </w:r>
+          </w:p>
+          <w:p>
+            <w:pPr>
+              <w:spacing w:after="120"/>
+              <w:rPr>
                 <w:rFonts w:ascii="Calibri" w:hAnsi="Calibri" w:cs="Calibri"/>
                 <w:sz w:val="24"/>
                 <w:szCs w:val="24"/>
               </w:rPr>
-              <w:t xml:space="preserve">Technical scalability: cloud-native and multi-tenant from day one. Three design choices make scale cheap: (1) a connector architecture, so each new HRMS/ERP integration is a module, not a rebuild; (2) language packs — adding a language is configuration on top of Bhashini/Sarvam models, taking us from 3 to 11+ languages without re-engineering; (3) WhatsApp distribution, so onboarding a 1,000-worker factory is a data-ingestion exercise, not a device rollout.</w:t>
+            </w:pPr>
+            <w:r>
+              <w:rPr>
+                <w:rFonts w:ascii="Calibri" w:hAnsi="Calibri" w:cs="Calibri" w:eastAsia="Calibri"/>
+                <w:sz w:val="24"/>
+                <w:szCs w:val="24"/>
+              </w:rPr>
+              <w:t xml:space="preserve">Inclusive and replicable by design: voice-first for low literacy; entry-level Android and low bandwidth supported; “I don’t know” plus human-handoff guardrails; privacy by design — consent-first onboarding, data minimization, an audit log of every action, and DPDP Act-aligned handling with anonymized analytics only. We will publish a per-vertical deployment playbook so the pattern can be replicated, including in public-sector workforces (ASHA and anganwadi workers, municipal staff) through government or CSR partnerships.</w:t>
             </w:r>
           </w:p>
           <w:p>
@@ -4639,43 +4755,7 @@
             </w:pPr>
             <w:r>
               <w:rPr>
-                <w:rFonts w:ascii="Calibri" w:hAnsi="Calibri" w:cs="Calibri"/>
-                <w:sz w:val="24"/>
-                <w:szCs w:val="24"/>
-              </w:rPr>
-              <w:t xml:space="preserve">Market scalability: the same product serves hospitals, factories, warehouses, retail chains and facility-management firms with only content changes. India first; the model generalizes to any multilingual emerging-market workforce.</w:t>
-            </w:r>
-          </w:p>
-          <w:p>
-            <w:pPr>
-              <w:spacing w:after="120"/>
-              <w:rPr>
-                <w:rFonts w:ascii="Calibri" w:hAnsi="Calibri" w:cs="Calibri"/>
-                <w:sz w:val="24"/>
-                <w:szCs w:val="24"/>
-              </w:rPr>
-            </w:pPr>
-            <w:r>
-              <w:rPr>
-                <w:rFonts w:ascii="Calibri" w:hAnsi="Calibri" w:cs="Calibri"/>
-                <w:sz w:val="24"/>
-                <w:szCs w:val="24"/>
-              </w:rPr>
-              <w:t xml:space="preserve">Inclusive and replicable by design: voice-first for low literacy; entry-level Android and low bandwidth supported; “I don’t know” plus human-handoff guardrails; privacy by design — consent-first onboarding, data minimization, an audit log of every action, and DPDP Act-aligned handling with anonymized analytics only. We will publish a per-vertical deployment playbook so the pattern can be replicated, including in public-sector workforces (ASHA and anganwadi workers, municipal staff) through government or CSR partnerships.</w:t>
-            </w:r>
-          </w:p>
-          <w:p>
-            <w:pPr>
-              <w:spacing w:after="120"/>
-              <w:rPr>
-                <w:rFonts w:ascii="Calibri" w:hAnsi="Calibri" w:cs="Calibri"/>
-                <w:sz w:val="24"/>
-                <w:szCs w:val="24"/>
-              </w:rPr>
-            </w:pPr>
-            <w:r>
-              <w:rPr>
-                <w:rFonts w:ascii="Calibri" w:hAnsi="Calibri" w:cs="Calibri"/>
+                <w:rFonts w:ascii="Calibri" w:hAnsi="Calibri" w:cs="Calibri" w:eastAsia="Calibri"/>
                 <w:sz w:val="24"/>
                 <w:szCs w:val="24"/>
               </w:rPr>
@@ -4887,11 +4967,29 @@
             </w:pPr>
             <w:r>
               <w:rPr>
+                <w:rFonts w:ascii="Calibri" w:hAnsi="Calibri" w:cs="Calibri" w:eastAsia="Calibri"/>
+                <w:sz w:val="24"/>
+                <w:szCs w:val="24"/>
+              </w:rPr>
+              <w:t xml:space="preserve">Four hundred million Indians power our factories, hospitals and supply chains — and not one enterprise software product was built for them. Sahayak fixes that with the simplest possible interface: a voice note on WhatsApp, in your own language.</w:t>
+            </w:r>
+          </w:p>
+          <w:p>
+            <w:pPr>
+              <w:spacing w:after="120"/>
+              <w:rPr>
                 <w:rFonts w:ascii="Calibri" w:hAnsi="Calibri" w:cs="Calibri"/>
                 <w:sz w:val="24"/>
                 <w:szCs w:val="24"/>
               </w:rPr>
-              <w:t xml:space="preserve">Four hundred million Indians power our factories, hospitals and supply chains — and not one enterprise software product was built for them. Sahayak fixes that with the simplest possible interface: a voice note on WhatsApp, in your own language.</w:t>
+            </w:pPr>
+            <w:r>
+              <w:rPr>
+                <w:rFonts w:ascii="Calibri" w:hAnsi="Calibri" w:cs="Calibri" w:eastAsia="Calibri"/>
+                <w:sz w:val="24"/>
+                <w:szCs w:val="24"/>
+              </w:rPr>
+              <w:t xml:space="preserve">It deserves to win because it is: Inclusive by mechanic, not by mission statement — voice-first and WhatsApp-native, so a low-literacy worker on a ₹7,000 phone is a first-class user. Immediately practical — no app rollout, no hardware, deployable at a hospital or factory in days, with a working prototype demonstrated live. Genuinely agentic — it doesn’t just answer; it files the leave, raises the ticket, and shows HR what the workforce doesn’t know. Aligned with India’s moment — it is the workplace layer of Digital India, built on public digital infrastructure like Bhashini, and it serves the theme’s pillars directly: healthcare delivery, on-the-job skilling and financial awareness for low-wage workers. Scalable — one codebase, every vertical, every Indic language; from two pilot sites to a national inclusion layer.</w:t>
             </w:r>
           </w:p>
           <w:p>
@@ -4905,25 +5003,7 @@
             </w:pPr>
             <w:r>
               <w:rPr>
-                <w:rFonts w:ascii="Calibri" w:hAnsi="Calibri" w:cs="Calibri"/>
-                <w:sz w:val="24"/>
-                <w:szCs w:val="24"/>
-              </w:rPr>
-              <w:t xml:space="preserve">It deserves to win because it is: Inclusive by mechanic, not by mission statement — voice-first and WhatsApp-native, so a low-literacy worker on a ₹7,000 phone is a first-class user. Immediately practical — no app rollout, no hardware, deployable at a hospital or factory in days, with a working prototype demonstrated live. Genuinely agentic — it doesn’t just answer; it files the leave, raises the ticket, and shows HR what the workforce doesn’t know. Aligned with India’s moment — it is the workplace layer of Digital India, built on public digital infrastructure like Bhashini, and it serves the theme’s pillars directly: healthcare delivery, on-the-job skilling and financial awareness for low-wage workers. Scalable — one codebase, every vertical, every Indic language; from two pilot sites to a national inclusion layer.</w:t>
-            </w:r>
-          </w:p>
-          <w:p>
-            <w:pPr>
-              <w:spacing w:after="120"/>
-              <w:rPr>
-                <w:rFonts w:ascii="Calibri" w:hAnsi="Calibri" w:cs="Calibri"/>
-                <w:sz w:val="24"/>
-                <w:szCs w:val="24"/>
-              </w:rPr>
-            </w:pPr>
-            <w:r>
-              <w:rPr>
-                <w:rFonts w:ascii="Calibri" w:hAnsi="Calibri" w:cs="Calibri"/>
+                <w:rFonts w:ascii="Calibri" w:hAnsi="Calibri" w:cs="Calibri" w:eastAsia="Calibri"/>
                 <w:sz w:val="24"/>
                 <w:szCs w:val="24"/>
               </w:rPr>
@@ -5436,16 +5516,17 @@
                 <w:szCs w:val="24"/>
               </w:rPr>
             </w:pPr>
-            <w:r>
-              <w:rPr>
-                <w:rFonts w:ascii="Calibri" w:hAnsi="Calibri" w:cs="Calibri"/>
-                <w:sz w:val="24"/>
-                <w:szCs w:val="24"/>
-              </w:rPr>
-            </w:r>
-            <w:r>
-              <w:t>Pending before portal submission: paste the public Google Drive folder URL containing the execution-plan deck, demo video, walkthrough PDF, screenshots and team profile document.</w:t>
-            </w:r>
+            <w:hyperlink r:id="rId15">
+              <w:r>
+                <w:rPr>
+                  <w:rFonts w:ascii="Calibri" w:hAnsi="Calibri" w:eastAsia="Calibri"/>
+                  <w:color w:val="0563C1"/>
+                  <w:u w:val="single"/>
+                  <w:sz w:val="24"/>
+                </w:rPr>
+                <w:t>https://drive.google.com/drive/folders/19pRFdnSpZ4BHpocK5CGMBBHtTsRhNSZ0</w:t>
+              </w:r>
+            </w:hyperlink>
           </w:p>
         </w:tc>
       </w:tr>

</xml_diff>